<commit_message>
fix(server): harden CORS, bind 0.0.0.0, sanitize error messages, and add node engine
</commit_message>
<xml_diff>
--- a/server/assets/cv/Vishal_Sharma_CV.docx
+++ b/server/assets/cv/Vishal_Sharma_CV.docx
@@ -11,30 +11,30 @@
           <w:b/>
           <w:bCs/>
           <w:color w:val="12141A"/>
-          <w:sz w:val="38"/>
-          <w:szCs w:val="38"/>
+          <w:sz w:val="36"/>
+          <w:szCs w:val="36"/>
         </w:rPr>
         <w:t xml:space="preserve">Vishal Sharma</w:t>
       </w:r>
     </w:p>
     <w:p>
       <w:pPr>
-        <w:spacing w:after="40" w:before="0"/>
+        <w:spacing w:after="30" w:before="0"/>
       </w:pPr>
       <w:r>
         <w:rPr>
           <w:b/>
           <w:bCs/>
           <w:color w:val="166A45"/>
-          <w:sz w:val="22"/>
-          <w:szCs w:val="22"/>
+          <w:sz w:val="20"/>
+          <w:szCs w:val="20"/>
         </w:rPr>
         <w:t xml:space="preserve">Software Engineer</w:t>
       </w:r>
     </w:p>
     <w:p>
       <w:pPr>
-        <w:spacing w:after="100" w:before="0"/>
+        <w:spacing w:after="80" w:before="0"/>
       </w:pPr>
       <w:r>
         <w:rPr>
@@ -42,7 +42,7 @@
           <w:sz w:val="17"/>
           <w:szCs w:val="17"/>
         </w:rPr>
-        <w:t xml:space="preserve">Jaipur, India  |  [Email – to confirm]  |  [GitHub URL – to confirm]  |  [LinkedIn URL – to confirm]</w:t>
+        <w:t xml:space="preserve">Jaipur, India   |   vishal.sharma.tech1@gmail.com</w:t>
       </w:r>
     </w:p>
     <w:p>
@@ -51,28 +51,28 @@
         <w:pBdr>
           <w:bottom w:val="single" w:color="D9D4C7" w:sz="6" w:space="1"/>
         </w:pBdr>
-        <w:spacing w:after="60" w:before="140"/>
+        <w:spacing w:after="40" w:before="120"/>
       </w:pPr>
       <w:r>
         <w:rPr>
           <w:b/>
           <w:bCs/>
           <w:color w:val="166A45"/>
-          <w:sz w:val="20"/>
-          <w:szCs w:val="20"/>
+          <w:sz w:val="19"/>
+          <w:szCs w:val="19"/>
         </w:rPr>
         <w:t xml:space="preserve">PROFESSIONAL SUMMARY</w:t>
       </w:r>
     </w:p>
     <w:p>
       <w:pPr>
-        <w:spacing w:after="80" w:before="40"/>
+        <w:spacing w:after="60" w:before="30"/>
       </w:pPr>
       <w:r>
         <w:rPr>
           <w:color w:val="12141A"/>
-          <w:sz w:val="18"/>
-          <w:szCs w:val="18"/>
+          <w:sz w:val="17"/>
+          <w:szCs w:val="17"/>
         </w:rPr>
         <w:t xml:space="preserve">Computer Science undergraduate specializing in backend architecture, REST API engineering, and scalable software systems. Experienced in developing secure service layers, relational and document database integrations, and intelligent web applications.</w:t>
       </w:r>
@@ -83,51 +83,51 @@
         <w:pBdr>
           <w:bottom w:val="single" w:color="D9D4C7" w:sz="6" w:space="1"/>
         </w:pBdr>
-        <w:spacing w:after="60" w:before="140"/>
+        <w:spacing w:after="40" w:before="120"/>
       </w:pPr>
       <w:r>
         <w:rPr>
           <w:b/>
           <w:bCs/>
           <w:color w:val="166A45"/>
-          <w:sz w:val="20"/>
-          <w:szCs w:val="20"/>
-        </w:rPr>
-        <w:t xml:space="preserve">EDUCATION</w:t>
-      </w:r>
-    </w:p>
-    <w:p>
-      <w:pPr>
-        <w:spacing w:after="20" w:before="40"/>
-      </w:pPr>
-      <w:r>
-        <w:rPr>
-          <w:b/>
-          <w:bCs/>
-          <w:color w:val="12141A"/>
           <w:sz w:val="19"/>
           <w:szCs w:val="19"/>
         </w:rPr>
+        <w:t xml:space="preserve">EDUCATION</w:t>
+      </w:r>
+    </w:p>
+    <w:p>
+      <w:pPr>
+        <w:spacing w:after="20" w:before="30"/>
+      </w:pPr>
+      <w:r>
+        <w:rPr>
+          <w:b/>
+          <w:bCs/>
+          <w:color w:val="12141A"/>
+          <w:sz w:val="18"/>
+          <w:szCs w:val="18"/>
+        </w:rPr>
         <w:t xml:space="preserve">B.Tech in Computer Science and Engineering</w:t>
       </w:r>
+      <w:r>
+        <w:rPr>
+          <w:color w:val="4A4F5C"/>
+          <w:sz w:val="16"/>
+          <w:szCs w:val="16"/>
+        </w:rPr>
+        <w:t xml:space="preserve">  —  Expected Graduation: 2028</w:t>
+      </w:r>
+    </w:p>
+    <w:p>
+      <w:pPr>
+        <w:spacing w:after="60" w:before="0"/>
+      </w:pPr>
       <w:r>
         <w:rPr>
           <w:color w:val="4A4F5C"/>
           <w:sz w:val="17"/>
           <w:szCs w:val="17"/>
-        </w:rPr>
-        <w:t xml:space="preserve">  —  Expected Graduation: 2028</w:t>
-      </w:r>
-    </w:p>
-    <w:p>
-      <w:pPr>
-        <w:spacing w:after="80" w:before="0"/>
-      </w:pPr>
-      <w:r>
-        <w:rPr>
-          <w:color w:val="4A4F5C"/>
-          <w:sz w:val="18"/>
-          <w:szCs w:val="18"/>
         </w:rPr>
         <w:t xml:space="preserve">JK Lakshmipat University, Jaipur (Current Student)</w:t>
       </w:r>
@@ -138,109 +138,53 @@
         <w:pBdr>
           <w:bottom w:val="single" w:color="D9D4C7" w:sz="6" w:space="1"/>
         </w:pBdr>
-        <w:spacing w:after="60" w:before="140"/>
+        <w:spacing w:after="40" w:before="120"/>
       </w:pPr>
       <w:r>
         <w:rPr>
           <w:b/>
           <w:bCs/>
           <w:color w:val="166A45"/>
-          <w:sz w:val="20"/>
-          <w:szCs w:val="20"/>
-        </w:rPr>
-        <w:t xml:space="preserve">TECHNICAL SKILLS</w:t>
-      </w:r>
-    </w:p>
-    <w:p>
-      <w:pPr>
-        <w:spacing w:after="20" w:before="20"/>
+          <w:sz w:val="19"/>
+          <w:szCs w:val="19"/>
+        </w:rPr>
+        <w:t xml:space="preserve">EXPERIENCE</w:t>
+      </w:r>
+    </w:p>
+    <w:p>
+      <w:pPr>
+        <w:spacing w:after="20" w:before="30"/>
       </w:pPr>
       <w:r>
         <w:rPr>
           <w:b/>
           <w:bCs/>
           <w:color w:val="12141A"/>
-          <w:sz w:val="17"/>
-          <w:szCs w:val="17"/>
-        </w:rPr>
-        <w:t xml:space="preserve">• Languages: </w:t>
-      </w:r>
-      <w:r>
-        <w:rPr>
-          <w:color w:val="4A4F5C"/>
-          <w:sz w:val="17"/>
-          <w:szCs w:val="17"/>
-        </w:rPr>
-        <w:t xml:space="preserve">Java, C++, JavaScript, Python, SQL</w:t>
-      </w:r>
-    </w:p>
-    <w:p>
-      <w:pPr>
-        <w:spacing w:after="20" w:before="20"/>
-      </w:pPr>
-      <w:r>
-        <w:rPr>
-          <w:b/>
-          <w:bCs/>
+          <w:sz w:val="18"/>
+          <w:szCs w:val="18"/>
+        </w:rPr>
+        <w:t xml:space="preserve">JGS Jaipur Global Services Pvt. Ltd., Jaipur</w:t>
+      </w:r>
+      <w:r>
+        <w:rPr>
+          <w:color w:val="4A4F5C"/>
+          <w:sz w:val="16"/>
+          <w:szCs w:val="16"/>
+        </w:rPr>
+        <w:t xml:space="preserve">  —  18 May 2026 – 18 July 2026 (Internship)</w:t>
+      </w:r>
+    </w:p>
+    <w:p>
+      <w:pPr>
+        <w:spacing w:after="60" w:before="0"/>
+      </w:pPr>
+      <w:r>
+        <w:rPr>
           <w:color w:val="12141A"/>
-          <w:sz w:val="17"/>
-          <w:szCs w:val="17"/>
-        </w:rPr>
-        <w:t xml:space="preserve">• Frameworks &amp; APIs: </w:t>
-      </w:r>
-      <w:r>
-        <w:rPr>
-          <w:color w:val="4A4F5C"/>
-          <w:sz w:val="17"/>
-          <w:szCs w:val="17"/>
-        </w:rPr>
-        <w:t xml:space="preserve">Spring Boot, REST APIs, Node.js, Express, React</w:t>
-      </w:r>
-    </w:p>
-    <w:p>
-      <w:pPr>
-        <w:spacing w:after="20" w:before="20"/>
-      </w:pPr>
-      <w:r>
-        <w:rPr>
-          <w:b/>
-          <w:bCs/>
-          <w:color w:val="12141A"/>
-          <w:sz w:val="17"/>
-          <w:szCs w:val="17"/>
-        </w:rPr>
-        <w:t xml:space="preserve">• Databases: </w:t>
-      </w:r>
-      <w:r>
-        <w:rPr>
-          <w:color w:val="4A4F5C"/>
-          <w:sz w:val="17"/>
-          <w:szCs w:val="17"/>
-        </w:rPr>
-        <w:t xml:space="preserve">PostgreSQL, MySQL, MongoDB</w:t>
-      </w:r>
-    </w:p>
-    <w:p>
-      <w:pPr>
-        <w:spacing w:after="20" w:before="20"/>
-      </w:pPr>
-      <w:r>
-        <w:rPr>
-          <w:b/>
-          <w:bCs/>
-          <w:color w:val="12141A"/>
-          <w:sz w:val="17"/>
-          <w:szCs w:val="17"/>
-        </w:rPr>
-        <w:t xml:space="preserve">• Tools &amp; Workflow: </w:t>
-      </w:r>
-      <w:r>
-        <w:rPr>
-          <w:color w:val="4A4F5C"/>
-          <w:sz w:val="17"/>
-          <w:szCs w:val="17"/>
-        </w:rPr>
-        <w:t xml:space="preserve">Git, GitHub, Maven, Postman</w:t>
+          <w:sz w:val="16"/>
+          <w:szCs w:val="16"/>
+        </w:rPr>
+        <w:t xml:space="preserve">Engineered backend service layer and data persistence for SellerLensIQ, an Amazon keyword research and listing SEO platform. Built Spring Boot REST APIs, implemented authentication, CSV bulk ingestion pipeline, and PostgreSQL database models.</w:t>
       </w:r>
     </w:p>
     <w:p>
@@ -249,170 +193,86 @@
         <w:pBdr>
           <w:bottom w:val="single" w:color="D9D4C7" w:sz="6" w:space="1"/>
         </w:pBdr>
-        <w:spacing w:after="60" w:before="140"/>
+        <w:spacing w:after="40" w:before="120"/>
       </w:pPr>
       <w:r>
         <w:rPr>
           <w:b/>
           <w:bCs/>
           <w:color w:val="166A45"/>
-          <w:sz w:val="20"/>
-          <w:szCs w:val="20"/>
-        </w:rPr>
-        <w:t xml:space="preserve">PROJECTS</w:t>
-      </w:r>
-    </w:p>
-    <w:p>
-      <w:pPr>
-        <w:spacing w:after="20" w:before="40"/>
-      </w:pPr>
-      <w:r>
-        <w:rPr>
-          <w:b/>
-          <w:bCs/>
-          <w:color w:val="12141A"/>
           <w:sz w:val="19"/>
           <w:szCs w:val="19"/>
         </w:rPr>
-        <w:t xml:space="preserve">SellerLensIQ</w:t>
-      </w:r>
-      <w:r>
-        <w:rPr>
-          <w:color w:val="166A45"/>
-          <w:sz w:val="17"/>
-          <w:szCs w:val="17"/>
-        </w:rPr>
-        <w:t xml:space="preserve">  [React, Node.js, MongoDB, REST APIs]</w:t>
-      </w:r>
-    </w:p>
-    <w:p>
-      <w:pPr>
-        <w:spacing w:after="20" w:before="0"/>
-      </w:pPr>
-      <w:r>
-        <w:rPr>
-          <w:color w:val="4A4F5C"/>
-          <w:sz w:val="17"/>
-          <w:szCs w:val="17"/>
-        </w:rPr>
-        <w:t xml:space="preserve">Intelligent e-commerce analytics and monitoring platform. Architected RESTful endpoints, implemented data persistence models, and designed interactive analytics views.</w:t>
-      </w:r>
-    </w:p>
-    <w:p>
-      <w:pPr>
-        <w:spacing w:after="60" w:before="0"/>
-      </w:pPr>
-      <w:r>
-        <w:rPr>
-          <w:i/>
-          <w:iCs/>
-          <w:color w:val="166A45"/>
-          <w:sz w:val="16"/>
-          <w:szCs w:val="16"/>
-        </w:rPr>
-        <w:t xml:space="preserve">[GitHub URL – to confirm] · [Live Demo – to confirm]</w:t>
-      </w:r>
-    </w:p>
-    <w:p>
-      <w:pPr>
-        <w:spacing w:after="20" w:before="40"/>
+        <w:t xml:space="preserve">TECHNICAL SKILLS</w:t>
+      </w:r>
+    </w:p>
+    <w:p>
+      <w:pPr>
+        <w:spacing w:after="15" w:before="15"/>
       </w:pPr>
       <w:r>
         <w:rPr>
           <w:b/>
           <w:bCs/>
           <w:color w:val="12141A"/>
-          <w:sz w:val="19"/>
-          <w:szCs w:val="19"/>
-        </w:rPr>
-        <w:t xml:space="preserve">Clinic Management System</w:t>
-      </w:r>
-      <w:r>
-        <w:rPr>
-          <w:color w:val="166A45"/>
-          <w:sz w:val="17"/>
-          <w:szCs w:val="17"/>
-        </w:rPr>
-        <w:t xml:space="preserve">  [Java, Spring Boot, MySQL, REST APIs]</w:t>
-      </w:r>
-    </w:p>
-    <w:p>
-      <w:pPr>
-        <w:spacing w:after="20" w:before="0"/>
-      </w:pPr>
-      <w:r>
-        <w:rPr>
-          <w:color w:val="4A4F5C"/>
-          <w:sz w:val="17"/>
-          <w:szCs w:val="17"/>
-        </w:rPr>
-        <w:t xml:space="preserve">Healthcare scheduling and patient record management system. Implemented structured domain models, secure REST endpoints, and relational database persistence.</w:t>
-      </w:r>
-    </w:p>
-    <w:p>
-      <w:pPr>
-        <w:spacing w:after="60" w:before="0"/>
-      </w:pPr>
-      <w:r>
-        <w:rPr>
-          <w:i/>
-          <w:iCs/>
-          <w:color w:val="166A45"/>
-          <w:sz w:val="16"/>
-          <w:szCs w:val="16"/>
-        </w:rPr>
-        <w:t xml:space="preserve">[GitHub URL – to confirm] · [Live Demo – to confirm]</w:t>
-      </w:r>
-    </w:p>
-    <w:p>
-      <w:pPr>
-        <w:spacing w:after="20" w:before="40"/>
+          <w:sz w:val="16"/>
+          <w:szCs w:val="16"/>
+        </w:rPr>
+        <w:t xml:space="preserve">• Frontend: </w:t>
+      </w:r>
+      <w:r>
+        <w:rPr>
+          <w:color w:val="4A4F5C"/>
+          <w:sz w:val="16"/>
+          <w:szCs w:val="16"/>
+        </w:rPr>
+        <w:t xml:space="preserve">JavaScript, React</w:t>
+      </w:r>
+    </w:p>
+    <w:p>
+      <w:pPr>
+        <w:spacing w:after="15" w:before="15"/>
       </w:pPr>
       <w:r>
         <w:rPr>
           <w:b/>
           <w:bCs/>
           <w:color w:val="12141A"/>
-          <w:sz w:val="19"/>
-          <w:szCs w:val="19"/>
-        </w:rPr>
-        <w:t xml:space="preserve">Developer Portfolio</w:t>
-      </w:r>
-      <w:r>
-        <w:rPr>
-          <w:color w:val="166A45"/>
-          <w:sz w:val="17"/>
-          <w:szCs w:val="17"/>
-        </w:rPr>
-        <w:t xml:space="preserve">  [React, Node.js, Express, MongoDB]</w:t>
-      </w:r>
-    </w:p>
-    <w:p>
-      <w:pPr>
-        <w:spacing w:after="20" w:before="0"/>
-      </w:pPr>
-      <w:r>
-        <w:rPr>
-          <w:color w:val="4A4F5C"/>
-          <w:sz w:val="17"/>
-          <w:szCs w:val="17"/>
-        </w:rPr>
-        <w:t xml:space="preserve">Interactive full-stack portfolio built around a live request-path architecture. Features automated CV generation and serving, API health telemetry, and MongoDB contact persistence.</w:t>
-      </w:r>
-    </w:p>
-    <w:p>
-      <w:pPr>
-        <w:spacing w:after="60" w:before="0"/>
-      </w:pPr>
-      <w:r>
-        <w:rPr>
-          <w:i/>
-          <w:iCs/>
-          <w:color w:val="166A45"/>
-          <w:sz w:val="16"/>
-          <w:szCs w:val="16"/>
-        </w:rPr>
-        <w:t xml:space="preserve">[GitHub URL – to confirm] · [Live Demo – to confirm]</w:t>
+          <w:sz w:val="16"/>
+          <w:szCs w:val="16"/>
+        </w:rPr>
+        <w:t xml:space="preserve">• Backend: </w:t>
+      </w:r>
+      <w:r>
+        <w:rPr>
+          <w:color w:val="4A4F5C"/>
+          <w:sz w:val="16"/>
+          <w:szCs w:val="16"/>
+        </w:rPr>
+        <w:t xml:space="preserve">Java, C++, Python, Spring Boot, REST APIs, Node.js, Express, PostgreSQL, MySQL, MongoDB, SQL</w:t>
+      </w:r>
+    </w:p>
+    <w:p>
+      <w:pPr>
+        <w:spacing w:after="15" w:before="15"/>
+      </w:pPr>
+      <w:r>
+        <w:rPr>
+          <w:b/>
+          <w:bCs/>
+          <w:color w:val="12141A"/>
+          <w:sz w:val="16"/>
+          <w:szCs w:val="16"/>
+        </w:rPr>
+        <w:t xml:space="preserve">• Tools &amp; Technologies: </w:t>
+      </w:r>
+      <w:r>
+        <w:rPr>
+          <w:color w:val="4A4F5C"/>
+          <w:sz w:val="16"/>
+          <w:szCs w:val="16"/>
+        </w:rPr>
+        <w:t xml:space="preserve">Git, GitHub, Maven, Postman, Practical AI Integration, AI-Assisted App Development</w:t>
       </w:r>
     </w:p>
     <w:p>
@@ -421,30 +281,193 @@
         <w:pBdr>
           <w:bottom w:val="single" w:color="D9D4C7" w:sz="6" w:space="1"/>
         </w:pBdr>
-        <w:spacing w:after="60" w:before="140"/>
+        <w:spacing w:after="40" w:before="120"/>
       </w:pPr>
       <w:r>
         <w:rPr>
           <w:b/>
           <w:bCs/>
           <w:color w:val="166A45"/>
-          <w:sz w:val="20"/>
-          <w:szCs w:val="20"/>
-        </w:rPr>
-        <w:t xml:space="preserve">CORE COMPETENCIES &amp; FOCUS AREAS</w:t>
-      </w:r>
-    </w:p>
-    <w:p>
-      <w:pPr>
-        <w:spacing w:after="40" w:before="40"/>
-      </w:pPr>
-      <w:r>
-        <w:rPr>
+          <w:sz w:val="19"/>
+          <w:szCs w:val="19"/>
+        </w:rPr>
+        <w:t xml:space="preserve">PROJECTS SHOWCASE</w:t>
+      </w:r>
+    </w:p>
+    <w:p>
+      <w:pPr>
+        <w:spacing w:after="15" w:before="30"/>
+      </w:pPr>
+      <w:r>
+        <w:rPr>
+          <w:b/>
+          <w:bCs/>
           <w:color w:val="12141A"/>
-          <w:sz w:val="17"/>
-          <w:szCs w:val="17"/>
-        </w:rPr>
-        <w:t xml:space="preserve">API Design &amp; Implementation   •   Database Integration &amp; Modeling   •   Authentication &amp; Security   •   AI-Assisted Application Development</w:t>
+          <w:sz w:val="18"/>
+          <w:szCs w:val="18"/>
+        </w:rPr>
+        <w:t xml:space="preserve">SellerLensIQ</w:t>
+      </w:r>
+      <w:r>
+        <w:rPr>
+          <w:b/>
+          <w:bCs/>
+          <w:color w:val="166A45"/>
+          <w:sz w:val="16"/>
+          <w:szCs w:val="16"/>
+        </w:rPr>
+        <w:t xml:space="preserve">  [Java, Spring Boot, PostgreSQL, REST APIs]</w:t>
+      </w:r>
+      <w:r>
+        <w:rPr>
+          <w:i/>
+          <w:iCs/>
+          <w:color w:val="4A4F5C"/>
+          <w:sz w:val="15"/>
+          <w:szCs w:val="15"/>
+        </w:rPr>
+        <w:t xml:space="preserve">  (Associated with JGS)</w:t>
+      </w:r>
+    </w:p>
+    <w:p>
+      <w:pPr>
+        <w:spacing w:after="40" w:before="0"/>
+      </w:pPr>
+      <w:r>
+        <w:rPr>
+          <w:color w:val="4A4F5C"/>
+          <w:sz w:val="16"/>
+          <w:szCs w:val="16"/>
+        </w:rPr>
+        <w:t xml:space="preserve">Amazon keyword research and listing SEO intelligence platform. Engineered RESTful endpoints for keyword portfolio tracking, CSV bulk upload pipeline, and PostgreSQL persistence.</w:t>
+      </w:r>
+    </w:p>
+    <w:p>
+      <w:pPr>
+        <w:spacing w:after="15" w:before="30"/>
+      </w:pPr>
+      <w:r>
+        <w:rPr>
+          <w:b/>
+          <w:bCs/>
+          <w:color w:val="12141A"/>
+          <w:sz w:val="18"/>
+          <w:szCs w:val="18"/>
+        </w:rPr>
+        <w:t xml:space="preserve">ClinicSaaS</w:t>
+      </w:r>
+      <w:r>
+        <w:rPr>
+          <w:b/>
+          <w:bCs/>
+          <w:color w:val="166A45"/>
+          <w:sz w:val="16"/>
+          <w:szCs w:val="16"/>
+        </w:rPr>
+        <w:t xml:space="preserve">  [Java, Spring Boot, REST APIs]</w:t>
+      </w:r>
+      <w:r>
+        <w:rPr>
+          <w:i/>
+          <w:iCs/>
+          <w:color w:val="4A4F5C"/>
+          <w:sz w:val="15"/>
+          <w:szCs w:val="15"/>
+        </w:rPr>
+        <w:t xml:space="preserve">  (In Progress)</w:t>
+      </w:r>
+    </w:p>
+    <w:p>
+      <w:pPr>
+        <w:spacing w:after="40" w:before="0"/>
+      </w:pPr>
+      <w:r>
+        <w:rPr>
+          <w:color w:val="4A4F5C"/>
+          <w:sz w:val="16"/>
+          <w:szCs w:val="16"/>
+        </w:rPr>
+        <w:t xml:space="preserve">Healthcare clinic management application for administrative and appointment workflows. Implemented structured domain models, doctor scheduling logic, and secure REST endpoints.</w:t>
+      </w:r>
+    </w:p>
+    <w:p>
+      <w:pPr>
+        <w:spacing w:after="15" w:before="30"/>
+      </w:pPr>
+      <w:r>
+        <w:rPr>
+          <w:b/>
+          <w:bCs/>
+          <w:color w:val="12141A"/>
+          <w:sz w:val="18"/>
+          <w:szCs w:val="18"/>
+        </w:rPr>
+        <w:t xml:space="preserve">Vaani Bill</w:t>
+      </w:r>
+      <w:r>
+        <w:rPr>
+          <w:b/>
+          <w:bCs/>
+          <w:color w:val="166A45"/>
+          <w:sz w:val="16"/>
+          <w:szCs w:val="16"/>
+        </w:rPr>
+        <w:t xml:space="preserve">  [React, Node.js, REST APIs]</w:t>
+      </w:r>
+      <w:r>
+        <w:rPr>
+          <w:i/>
+          <w:iCs/>
+          <w:color w:val="4A4F5C"/>
+          <w:sz w:val="15"/>
+          <w:szCs w:val="15"/>
+        </w:rPr>
+        <w:t xml:space="preserve">  (Concept)</w:t>
+      </w:r>
+    </w:p>
+    <w:p>
+      <w:pPr>
+        <w:spacing w:after="40" w:before="0"/>
+      </w:pPr>
+      <w:r>
+        <w:rPr>
+          <w:color w:val="4A4F5C"/>
+          <w:sz w:val="16"/>
+          <w:szCs w:val="16"/>
+        </w:rPr>
+        <w:t xml:space="preserve">AI voice point-of-sale concept exploring billing simplification through Hindi, English, and Hinglish speech interactions. (Product concept, not yet deployed).</w:t>
+      </w:r>
+    </w:p>
+    <w:p>
+      <w:pPr>
+        <w:pStyle w:val="Heading2"/>
+        <w:pBdr>
+          <w:bottom w:val="single" w:color="D9D4C7" w:sz="6" w:space="1"/>
+        </w:pBdr>
+        <w:spacing w:after="40" w:before="120"/>
+      </w:pPr>
+      <w:r>
+        <w:rPr>
+          <w:b/>
+          <w:bCs/>
+          <w:color w:val="166A45"/>
+          <w:sz w:val="19"/>
+          <w:szCs w:val="19"/>
+        </w:rPr>
+        <w:t xml:space="preserve">CORE COMPETENCIES &amp; ENGINEERING FOCUS</w:t>
+      </w:r>
+    </w:p>
+    <w:p>
+      <w:pPr>
+        <w:spacing w:after="30" w:before="30"/>
+      </w:pPr>
+      <w:r>
+        <w:rPr>
+          <w:color w:val="12141A"/>
+          <w:sz w:val="16"/>
+          <w:szCs w:val="16"/>
+        </w:rPr>
+        <w:t xml:space="preserve">Strict API Contracts &amp; Schema Validation   •   Relational &amp; Document Persistence Boundaries   •   Defensive Security &amp; Middleware Architecture   •   Practical AI Systems Integration</w:t>
       </w:r>
     </w:p>
     <w:sectPr>

</xml_diff>